<commit_message>
Refactor Vehicle Characteristics and Crash Involvement Tables
- Updated Vehicle_Characteristics table schema:
  - Changed VEHICLE_ID from CHAR(1) to VARCHAR(20).
  - Expanded VARCHAR lengths for VEHICLE_TYPE_DESC, VEHICLE_BODY_STYLE, VEHICLE_MAKE, and VEHICLE_MODEL.
  - Removed unnecessary columns and constraints.
  - Added new constraints for data validation.
  - Created new indexes for improved query performance.

- Deleted obsolete version of Vehicle_Characteristics_v4.sql.

- Updated Vehicle_Crash_Involvement table schema:
  - Changed VEHICLE_ID from CHAR(1) to VARCHAR(20).
  - Adjusted column types and removed unnecessary constraints.
  - Added new constraints for data validation.
  - Created new indexes for improved query performance.

- Deleted obsolete version of Vehicle_Crash_Involvement_v4.sql.

- Removed vehicle-cleaning.py script as it is no longer needed.
</commit_message>
<xml_diff>
--- a/docs/IFN655-A1-Report.docx
+++ b/docs/IFN655-A1-Report.docx
@@ -1,6 +1,6 @@
 
 <file path=word/document.xml><?xml version="1.0" encoding="utf-8"?>
-<w:document xmlns:wpc="http://schemas.microsoft.com/office/word/2010/wordprocessingCanvas" xmlns:cx="http://schemas.microsoft.com/office/drawing/2014/chartex" xmlns:cx1="http://schemas.microsoft.com/office/drawing/2015/9/8/chartex" xmlns:cx2="http://schemas.microsoft.com/office/drawing/2015/10/21/chartex" xmlns:cx3="http://schemas.microsoft.com/office/drawing/2016/5/9/chartex" xmlns:cx4="http://schemas.microsoft.com/office/drawing/2016/5/10/chartex" xmlns:cx5="http://schemas.microsoft.com/office/drawing/2016/5/11/chartex" xmlns:cx6="http://schemas.microsoft.com/office/drawing/2016/5/12/chartex" xmlns:cx7="http://schemas.microsoft.com/office/drawing/2016/5/13/chartex" xmlns:cx8="http://schemas.microsoft.com/office/drawing/2016/5/14/chartex" xmlns:mc="http://schemas.openxmlformats.org/markup-compatibility/2006" xmlns:aink="http://schemas.microsoft.com/office/drawing/2016/ink" xmlns:am3d="http://schemas.microsoft.com/office/drawing/2017/model3d" xmlns:o="urn:schemas-microsoft-com:office:office" xmlns:oel="http://schemas.microsoft.com/office/2019/extlst" xmlns:r="http://schemas.openxmlformats.org/officeDocument/2006/relationships" xmlns:m="http://schemas.openxmlformats.org/officeDocument/2006/math" xmlns:v="urn:schemas-microsoft-com:vml" xmlns:wp14="http://schemas.microsoft.com/office/word/2010/wordprocessingDrawing" xmlns:wp="http://schemas.openxmlformats.org/drawingml/2006/wordprocessingDrawing" xmlns:w10="urn:schemas-microsoft-com:office:word" xmlns:w="http://schemas.openxmlformats.org/wordprocessingml/2006/main" xmlns:w14="http://schemas.microsoft.com/office/word/2010/wordml" xmlns:w15="http://schemas.microsoft.com/office/word/2012/wordml" xmlns:w16cex="http://schemas.microsoft.com/office/word/2018/wordml/cex" xmlns:w16cid="http://schemas.microsoft.com/office/word/2016/wordml/cid" xmlns:w16="http://schemas.microsoft.com/office/word/2018/wordml" xmlns:w16du="http://schemas.microsoft.com/office/word/2023/wordml/word16du" xmlns:w16sdtdh="http://schemas.microsoft.com/office/word/2020/wordml/sdtdatahash" xmlns:w16sdtfl="http://schemas.microsoft.com/office/word/2024/wordml/sdtformatlock" xmlns:w16se="http://schemas.microsoft.com/office/word/2015/wordml/symex" xmlns:wpg="http://schemas.microsoft.com/office/word/2010/wordprocessingGroup" xmlns:wpi="http://schemas.microsoft.com/office/word/2010/wordprocessingInk" xmlns:wne="http://schemas.microsoft.com/office/word/2006/wordml" xmlns:wps="http://schemas.microsoft.com/office/word/2010/wordprocessingShape" xmlns:a="http://schemas.openxmlformats.org/drawingml/2006/main" xmlns:pic="http://schemas.openxmlformats.org/drawingml/2006/picture" xmlns:a14="http://schemas.microsoft.com/office/drawing/2010/main" xmlns:a16="http://schemas.microsoft.com/office/drawing/2014/main" mc:Ignorable="w14 w15 w16se w16cid w16 w16cex w16sdtdh w16sdtfl w16du wp14">
+<w:document xmlns:wpc="http://schemas.microsoft.com/office/word/2010/wordprocessingCanvas" xmlns:cx="http://schemas.microsoft.com/office/drawing/2014/chartex" xmlns:cx1="http://schemas.microsoft.com/office/drawing/2015/9/8/chartex" xmlns:cx2="http://schemas.microsoft.com/office/drawing/2015/10/21/chartex" xmlns:cx3="http://schemas.microsoft.com/office/drawing/2016/5/9/chartex" xmlns:cx4="http://schemas.microsoft.com/office/drawing/2016/5/10/chartex" xmlns:cx5="http://schemas.microsoft.com/office/drawing/2016/5/11/chartex" xmlns:cx6="http://schemas.microsoft.com/office/drawing/2016/5/12/chartex" xmlns:cx7="http://schemas.microsoft.com/office/drawing/2016/5/13/chartex" xmlns:cx8="http://schemas.microsoft.com/office/drawing/2016/5/14/chartex" xmlns:mc="http://schemas.openxmlformats.org/markup-compatibility/2006" xmlns:aink="http://schemas.microsoft.com/office/drawing/2016/ink" xmlns:am3d="http://schemas.microsoft.com/office/drawing/2017/model3d" xmlns:o="urn:schemas-microsoft-com:office:office" xmlns:oel="http://schemas.microsoft.com/office/2019/extlst" xmlns:r="http://schemas.openxmlformats.org/officeDocument/2006/relationships" xmlns:m="http://schemas.openxmlformats.org/officeDocument/2006/math" xmlns:v="urn:schemas-microsoft-com:vml" xmlns:wp14="http://schemas.microsoft.com/office/word/2010/wordprocessingDrawing" xmlns:wp="http://schemas.openxmlformats.org/drawingml/2006/wordprocessingDrawing" xmlns:w10="urn:schemas-microsoft-com:office:word" xmlns:w="http://schemas.openxmlformats.org/wordprocessingml/2006/main" xmlns:w14="http://schemas.microsoft.com/office/word/2010/wordml" xmlns:w15="http://schemas.microsoft.com/office/word/2012/wordml" xmlns:w16cex="http://schemas.microsoft.com/office/word/2018/wordml/cex" xmlns:w16cid="http://schemas.microsoft.com/office/word/2016/wordml/cid" xmlns:w16="http://schemas.microsoft.com/office/word/2018/wordml" xmlns:w16du="http://schemas.microsoft.com/office/word/2023/wordml/word16du" xmlns:w16sdtdh="http://schemas.microsoft.com/office/word/2020/wordml/sdtdatahash" xmlns:w16sdtfl="http://schemas.microsoft.com/office/word/2024/wordml/sdtformatlock" xmlns:w16se="http://schemas.microsoft.com/office/word/2015/wordml/symex" xmlns:wpg="http://schemas.microsoft.com/office/word/2010/wordprocessingGroup" xmlns:wpi="http://schemas.microsoft.com/office/word/2010/wordprocessingInk" xmlns:wne="http://schemas.microsoft.com/office/word/2006/wordml" xmlns:wps="http://schemas.microsoft.com/office/word/2010/wordprocessingShape" xmlns:a="http://schemas.openxmlformats.org/drawingml/2006/main" xmlns:a16="http://schemas.microsoft.com/office/drawing/2014/main" xmlns:pic="http://schemas.openxmlformats.org/drawingml/2006/picture" xmlns:a14="http://schemas.microsoft.com/office/drawing/2010/main" mc:Ignorable="w14 w15 w16se w16cid w16 w16cex w16sdtdh w16sdtfl w16du wp14">
   <w:body>
     <w:p>
       <w:pPr>
@@ -89,7 +89,11 @@
     <w:p>
       <w:pPr>
         <w:pStyle w:val="Heading2"/>
-        <w:rPr/>
+        <w:rPr>
+          <w:rFonts w:ascii="Cambria" w:hAnsi="Cambria"/>
+          <w:sz w:val="20"/>
+          <w:szCs w:val="20"/>
+        </w:rPr>
       </w:pPr>
       <w:r>
         <w:rPr/>
@@ -104,6 +108,11 @@
           <w:numId w:val="0"/>
         </w:numPr>
         <w:ind w:left="720"/>
+        <w:rPr>
+          <w:rFonts w:ascii="Cambria" w:hAnsi="Cambria"/>
+          <w:sz w:val="20"/>
+          <w:szCs w:val="20"/>
+        </w:rPr>
       </w:pPr>
     </w:p>
     <w:p>
@@ -113,8 +122,63 @@
           <w:ilvl w:val="0"/>
           <w:numId w:val="0"/>
         </w:numPr>
-        <w:ind w:left="720"/>
-      </w:pPr>
+        <w:ind w:left="0"/>
+        <w:jc w:val="center"/>
+        <w:rPr>
+          <w:rFonts w:ascii="Cambria" w:hAnsi="Cambria"/>
+          <w:sz w:val="20"/>
+          <w:szCs w:val="20"/>
+        </w:rPr>
+      </w:pPr>
+      <w:r>
+        <w:drawing>
+          <wp:inline wp14:editId="4A98404D" wp14:anchorId="6B77ED42">
+            <wp:extent cx="2771788" cy="3662989"/>
+            <wp:effectExtent l="0" t="0" r="0" b="0"/>
+            <wp:docPr id="1054580443" name="Picture 3">
+              <a:extLst>
+                <a:ext uri="{FF2B5EF4-FFF2-40B4-BE49-F238E27FC236}">
+                  <a16:creationId xmlns:a16="http://schemas.microsoft.com/office/drawing/2014/main" id="{7EBA4746-C4F0-4912-9A18-95E67D8D6A86}"/>
+                </a:ext>
+              </a:extLst>
+            </wp:docPr>
+            <wp:cNvGraphicFramePr>
+              <a:graphicFrameLocks noChangeAspect="1"/>
+            </wp:cNvGraphicFramePr>
+            <a:graphic>
+              <a:graphicData xmlns:a="http://schemas.openxmlformats.org/drawingml/2006/main" uri="http://schemas.openxmlformats.org/drawingml/2006/picture">
+                <pic:pic xmlns:pic="http://schemas.openxmlformats.org/drawingml/2006/picture">
+                  <pic:nvPicPr>
+                    <pic:cNvPr id="688107953" name="Picture 688107953"/>
+                    <pic:cNvPicPr/>
+                  </pic:nvPicPr>
+                  <pic:blipFill>
+                    <a:blip xmlns:r="http://schemas.openxmlformats.org/officeDocument/2006/relationships" r:embed="rId7">
+                      <a:extLst>
+                        <a:ext uri="{28A0092B-C50C-407E-A947-70E740481C1C}">
+                          <a14:useLocalDpi xmlns:a14="http://schemas.microsoft.com/office/drawing/2010/main"/>
+                        </a:ext>
+                      </a:extLst>
+                    </a:blip>
+                    <a:stretch>
+                      <a:fillRect/>
+                    </a:stretch>
+                  </pic:blipFill>
+                  <pic:spPr>
+                    <a:xfrm>
+                      <a:off x="0" y="0"/>
+                      <a:ext cx="2771788" cy="3662989"/>
+                    </a:xfrm>
+                    <a:prstGeom prst="rect">
+                      <a:avLst/>
+                    </a:prstGeom>
+                  </pic:spPr>
+                </pic:pic>
+              </a:graphicData>
+            </a:graphic>
+          </wp:inline>
+        </w:drawing>
+      </w:r>
     </w:p>
     <w:p>
       <w:pPr>
@@ -166,7 +230,7 @@
       </w:pPr>
       <w:r>
         <w:drawing>
-          <wp:inline wp14:editId="6D6D2572" wp14:anchorId="70FAFFD5">
+          <wp:inline wp14:editId="1D2524F2" wp14:anchorId="70FAFFD5">
             <wp:extent cx="2268693" cy="4514850"/>
             <wp:effectExtent l="0" t="0" r="0" b="0"/>
             <wp:docPr id="2098079247" name="drawing"/>
@@ -301,7 +365,7 @@
       </w:pPr>
       <w:r>
         <w:drawing>
-          <wp:inline wp14:editId="5BADC3A1" wp14:anchorId="693E51CE">
+          <wp:inline wp14:editId="4755C8C4" wp14:anchorId="693E51CE">
             <wp:extent cx="2699503" cy="4210638"/>
             <wp:effectExtent l="0" t="0" r="0" b="0"/>
             <wp:docPr id="1644034379" name="drawing"/>
@@ -391,7 +455,7 @@
       </w:pPr>
       <w:r>
         <w:drawing>
-          <wp:inline wp14:editId="5984A971" wp14:anchorId="666C4DB9">
+          <wp:inline wp14:editId="4B09CE53" wp14:anchorId="666C4DB9">
             <wp:extent cx="2000529" cy="1857634"/>
             <wp:effectExtent l="0" t="0" r="0" b="0"/>
             <wp:docPr id="1676424597" name="drawing"/>
@@ -554,7 +618,7 @@
       </w:pPr>
       <w:r>
         <w:drawing>
-          <wp:inline wp14:editId="6FE1FFA2" wp14:anchorId="31B8E478">
+          <wp:inline wp14:editId="7F4BDB7D" wp14:anchorId="31B8E478">
             <wp:extent cx="2905530" cy="3143689"/>
             <wp:effectExtent l="0" t="0" r="0" b="0"/>
             <wp:docPr id="658063906" name="drawing"/>
@@ -723,20 +787,19 @@
     </w:p>
     <w:p>
       <w:pPr>
-        <w:pStyle w:val="Heading1"/>
-        <w:ind w:left="0"/>
-        <w:rPr/>
-      </w:pPr>
-    </w:p>
-    <w:p>
-      <w:pPr>
         <w:pStyle w:val="Heading2"/>
-        <w:rPr/>
-      </w:pPr>
-      <w:r>
-        <w:rPr/>
-        <w:t>Accident.csv</w:t>
-      </w:r>
+        <w:numPr>
+          <w:ilvl w:val="0"/>
+          <w:numId w:val="0"/>
+        </w:numPr>
+        <w:ind w:left="720"/>
+        <w:rPr>
+          <w:b w:val="1"/>
+          <w:bCs w:val="1"/>
+          <w:sz w:val="20"/>
+          <w:szCs w:val="20"/>
+        </w:rPr>
+      </w:pPr>
     </w:p>
     <w:p>
       <w:pPr>
@@ -756,6 +819,12 @@
       <w:r>
         <w:t xml:space="preserve"> and ACCIDENT_TIME were loaded as plain text (strings) rather than valid datetime objects, preventing immediate time-series analysis.</w:t>
       </w:r>
+    </w:p>
+    <w:p>
+      <w:pPr>
+        <w:pStyle w:val="ListParagraph"/>
+        <w:jc w:val="center"/>
+      </w:pPr>
     </w:p>
     <w:p>
       <w:pPr>
@@ -767,69 +836,6 @@
           <w:szCs w:val="20"/>
         </w:rPr>
       </w:pPr>
-      <w:r>
-        <w:rPr>
-          <w:noProof/>
-        </w:rPr>
-        <w:drawing>
-          <wp:inline distT="0" distB="0" distL="0" distR="0" wp14:anchorId="54AD8B81" wp14:editId="138B5255">
-            <wp:extent cx="2771788" cy="3662989"/>
-            <wp:effectExtent l="0" t="0" r="0" b="0"/>
-            <wp:docPr id="688107953" name="Picture 3">
-              <a:extLst xmlns:a="http://schemas.openxmlformats.org/drawingml/2006/main">
-                <a:ext uri="{FF2B5EF4-FFF2-40B4-BE49-F238E27FC236}">
-                  <a16:creationId xmlns:a16="http://schemas.microsoft.com/office/drawing/2014/main" id="{7EBA4746-C4F0-4912-9A18-95E67D8D6A86}"/>
-                </a:ext>
-              </a:extLst>
-            </wp:docPr>
-            <wp:cNvGraphicFramePr>
-              <a:graphicFrameLocks xmlns:a="http://schemas.openxmlformats.org/drawingml/2006/main" noChangeAspect="1"/>
-            </wp:cNvGraphicFramePr>
-            <a:graphic xmlns:a="http://schemas.openxmlformats.org/drawingml/2006/main">
-              <a:graphicData uri="http://schemas.openxmlformats.org/drawingml/2006/picture">
-                <pic:pic xmlns:pic="http://schemas.openxmlformats.org/drawingml/2006/picture">
-                  <pic:nvPicPr>
-                    <pic:cNvPr id="688107953" name="Picture 688107953"/>
-                    <pic:cNvPicPr/>
-                  </pic:nvPicPr>
-                  <pic:blipFill>
-                    <a:blip r:embed="rId7">
-                      <a:extLst>
-                        <a:ext uri="{28A0092B-C50C-407E-A947-70E740481C1C}">
-                          <a14:useLocalDpi xmlns:a14="http://schemas.microsoft.com/office/drawing/2010/main"/>
-                        </a:ext>
-                      </a:extLst>
-                    </a:blip>
-                    <a:stretch>
-                      <a:fillRect/>
-                    </a:stretch>
-                  </pic:blipFill>
-                  <pic:spPr>
-                    <a:xfrm>
-                      <a:off x="0" y="0"/>
-                      <a:ext cx="2771788" cy="3662989"/>
-                    </a:xfrm>
-                    <a:prstGeom prst="rect">
-                      <a:avLst/>
-                    </a:prstGeom>
-                  </pic:spPr>
-                </pic:pic>
-              </a:graphicData>
-            </a:graphic>
-          </wp:inline>
-        </w:drawing>
-      </w:r>
-    </w:p>
-    <w:p>
-      <w:pPr>
-        <w:pStyle w:val="ListParagraph"/>
-        <w:jc w:val="center"/>
-        <w:rPr>
-          <w:rFonts w:ascii="Cambria" w:hAnsi="Cambria"/>
-          <w:sz w:val="20"/>
-          <w:szCs w:val="20"/>
-        </w:rPr>
-      </w:pPr>
     </w:p>
     <w:p>
       <w:pPr>
@@ -894,7 +900,7 @@
       </w:pPr>
       <w:r>
         <w:drawing>
-          <wp:inline wp14:editId="6EBC9404" wp14:anchorId="7B49E427">
+          <wp:inline wp14:editId="2215614B" wp14:anchorId="7B49E427">
             <wp:extent cx="2034107" cy="2449585"/>
             <wp:effectExtent l="0" t="0" r="0" b="1905"/>
             <wp:docPr id="1526920588" name="Picture 4">
@@ -967,7 +973,7 @@
       </w:pPr>
       <w:r>
         <w:drawing>
-          <wp:inline wp14:editId="399A8C05" wp14:anchorId="66C7DEE7">
+          <wp:inline wp14:editId="7CFF9476" wp14:anchorId="66C7DEE7">
             <wp:extent cx="2086089" cy="1786855"/>
             <wp:effectExtent l="0" t="0" r="0" b="4445"/>
             <wp:docPr id="1171407612" name="Picture 5">
@@ -1328,7 +1334,7 @@
       </w:r>
       <w:r>
         <w:drawing>
-          <wp:inline wp14:editId="156A8ED9" wp14:anchorId="6A3BA60A">
+          <wp:inline wp14:editId="70D20560" wp14:anchorId="6A3BA60A">
             <wp:extent cx="3905250" cy="2638155"/>
             <wp:effectExtent l="0" t="0" r="0" b="0"/>
             <wp:docPr id="2097225429" name="drawing">
@@ -1398,7 +1404,7 @@
       </w:pPr>
       <w:r>
         <w:drawing>
-          <wp:inline wp14:editId="45527014" wp14:anchorId="28734F78">
+          <wp:inline wp14:editId="5925D803" wp14:anchorId="28734F78">
             <wp:extent cx="4133850" cy="1341266"/>
             <wp:effectExtent l="0" t="0" r="0" b="0"/>
             <wp:docPr id="197282072" name="drawing">
@@ -1526,7 +1532,7 @@
       </w:pPr>
       <w:r>
         <w:drawing>
-          <wp:inline wp14:editId="42A21B1F" wp14:anchorId="303060A4">
+          <wp:inline wp14:editId="1477C924" wp14:anchorId="303060A4">
             <wp:extent cx="3414950" cy="2966063"/>
             <wp:effectExtent l="0" t="0" r="0" b="0"/>
             <wp:docPr id="671009313" name="drawing">
@@ -1907,6 +1913,95 @@
 
 <file path=word/numbering.xml><?xml version="1.0" encoding="utf-8"?>
 <w:numbering xmlns:wpc="http://schemas.microsoft.com/office/word/2010/wordprocessingCanvas" xmlns:cx="http://schemas.microsoft.com/office/drawing/2014/chartex" xmlns:cx1="http://schemas.microsoft.com/office/drawing/2015/9/8/chartex" xmlns:cx2="http://schemas.microsoft.com/office/drawing/2015/10/21/chartex" xmlns:cx3="http://schemas.microsoft.com/office/drawing/2016/5/9/chartex" xmlns:cx4="http://schemas.microsoft.com/office/drawing/2016/5/10/chartex" xmlns:cx5="http://schemas.microsoft.com/office/drawing/2016/5/11/chartex" xmlns:cx6="http://schemas.microsoft.com/office/drawing/2016/5/12/chartex" xmlns:cx7="http://schemas.microsoft.com/office/drawing/2016/5/13/chartex" xmlns:cx8="http://schemas.microsoft.com/office/drawing/2016/5/14/chartex" xmlns:mc="http://schemas.openxmlformats.org/markup-compatibility/2006" xmlns:aink="http://schemas.microsoft.com/office/drawing/2016/ink" xmlns:am3d="http://schemas.microsoft.com/office/drawing/2017/model3d" xmlns:o="urn:schemas-microsoft-com:office:office" xmlns:oel="http://schemas.microsoft.com/office/2019/extlst" xmlns:r="http://schemas.openxmlformats.org/officeDocument/2006/relationships" xmlns:m="http://schemas.openxmlformats.org/officeDocument/2006/math" xmlns:v="urn:schemas-microsoft-com:vml" xmlns:wp14="http://schemas.microsoft.com/office/word/2010/wordprocessingDrawing" xmlns:wp="http://schemas.openxmlformats.org/drawingml/2006/wordprocessingDrawing" xmlns:w10="urn:schemas-microsoft-com:office:word" xmlns:w="http://schemas.openxmlformats.org/wordprocessingml/2006/main" xmlns:w14="http://schemas.microsoft.com/office/word/2010/wordml" xmlns:w15="http://schemas.microsoft.com/office/word/2012/wordml" xmlns:w16cex="http://schemas.microsoft.com/office/word/2018/wordml/cex" xmlns:w16cid="http://schemas.microsoft.com/office/word/2016/wordml/cid" xmlns:w16="http://schemas.microsoft.com/office/word/2018/wordml" xmlns:w16du="http://schemas.microsoft.com/office/word/2023/wordml/word16du" xmlns:w16sdtdh="http://schemas.microsoft.com/office/word/2020/wordml/sdtdatahash" xmlns:w16sdtfl="http://schemas.microsoft.com/office/word/2024/wordml/sdtformatlock" xmlns:w16se="http://schemas.microsoft.com/office/word/2015/wordml/symex" xmlns:wpg="http://schemas.microsoft.com/office/word/2010/wordprocessingGroup" xmlns:wpi="http://schemas.microsoft.com/office/word/2010/wordprocessingInk" xmlns:wne="http://schemas.microsoft.com/office/word/2006/wordml" xmlns:wps="http://schemas.microsoft.com/office/word/2010/wordprocessingShape" mc:Ignorable="w14 w15 w16se w16cid w16 w16cex w16sdtdh w16sdtfl w16du wp14">
+  <w:abstractNum xmlns:w="http://schemas.openxmlformats.org/wordprocessingml/2006/main" w:abstractNumId="17">
+    <w:nsid w:val="9962c57"/>
+    <w:multiLevelType xmlns:w="http://schemas.openxmlformats.org/wordprocessingml/2006/main" w:val="multilevel"/>
+    <w:lvl xmlns:w="http://schemas.openxmlformats.org/wordprocessingml/2006/main" w:ilvl="0">
+      <w:start w:val="1"/>
+      <w:numFmt w:val="decimal"/>
+      <w:pStyle w:val="Heading2"/>
+      <w:lvlText w:val="%1.%2."/>
+      <w:lvlJc w:val="left"/>
+      <w:pPr>
+        <w:ind w:left="1440" w:hanging="360"/>
+      </w:pPr>
+      <w:rPr>
+        <w:rFonts w:hint="default" w:ascii="Cambria" w:hAnsi="Cambria"/>
+      </w:rPr>
+    </w:lvl>
+    <w:lvl xmlns:w="http://schemas.openxmlformats.org/wordprocessingml/2006/main" w:ilvl="1">
+      <w:start w:val="1"/>
+      <w:numFmt w:val="lowerLetter"/>
+      <w:lvlText w:val="%2."/>
+      <w:lvlJc w:val="left"/>
+      <w:pPr>
+        <w:ind w:left="1800" w:hanging="360"/>
+      </w:pPr>
+    </w:lvl>
+    <w:lvl xmlns:w="http://schemas.openxmlformats.org/wordprocessingml/2006/main" w:ilvl="2">
+      <w:start w:val="1"/>
+      <w:numFmt w:val="lowerRoman"/>
+      <w:lvlText w:val="%3."/>
+      <w:lvlJc w:val="right"/>
+      <w:pPr>
+        <w:ind w:left="2520" w:hanging="180"/>
+      </w:pPr>
+    </w:lvl>
+    <w:lvl xmlns:w="http://schemas.openxmlformats.org/wordprocessingml/2006/main" w:ilvl="3">
+      <w:start w:val="1"/>
+      <w:numFmt w:val="decimal"/>
+      <w:lvlText w:val="%4."/>
+      <w:lvlJc w:val="left"/>
+      <w:pPr>
+        <w:ind w:left="3240" w:hanging="360"/>
+      </w:pPr>
+    </w:lvl>
+    <w:lvl xmlns:w="http://schemas.openxmlformats.org/wordprocessingml/2006/main" w:ilvl="4">
+      <w:start w:val="1"/>
+      <w:numFmt w:val="lowerLetter"/>
+      <w:lvlText w:val="%5."/>
+      <w:lvlJc w:val="left"/>
+      <w:pPr>
+        <w:ind w:left="3960" w:hanging="360"/>
+      </w:pPr>
+    </w:lvl>
+    <w:lvl xmlns:w="http://schemas.openxmlformats.org/wordprocessingml/2006/main" w:ilvl="5">
+      <w:start w:val="1"/>
+      <w:numFmt w:val="lowerRoman"/>
+      <w:lvlText w:val="%6."/>
+      <w:lvlJc w:val="right"/>
+      <w:pPr>
+        <w:ind w:left="4680" w:hanging="180"/>
+      </w:pPr>
+    </w:lvl>
+    <w:lvl xmlns:w="http://schemas.openxmlformats.org/wordprocessingml/2006/main" w:ilvl="6">
+      <w:start w:val="1"/>
+      <w:numFmt w:val="decimal"/>
+      <w:lvlText w:val="%7."/>
+      <w:lvlJc w:val="left"/>
+      <w:pPr>
+        <w:ind w:left="5400" w:hanging="360"/>
+      </w:pPr>
+    </w:lvl>
+    <w:lvl xmlns:w="http://schemas.openxmlformats.org/wordprocessingml/2006/main" w:ilvl="7">
+      <w:start w:val="1"/>
+      <w:numFmt w:val="lowerLetter"/>
+      <w:lvlText w:val="%8."/>
+      <w:lvlJc w:val="left"/>
+      <w:pPr>
+        <w:ind w:left="6120" w:hanging="360"/>
+      </w:pPr>
+    </w:lvl>
+    <w:lvl xmlns:w="http://schemas.openxmlformats.org/wordprocessingml/2006/main" w:ilvl="8">
+      <w:start w:val="1"/>
+      <w:numFmt w:val="lowerRoman"/>
+      <w:lvlText w:val="%9."/>
+      <w:lvlJc w:val="right"/>
+      <w:pPr>
+        <w:ind w:left="6840" w:hanging="180"/>
+      </w:pPr>
+    </w:lvl>
+  </w:abstractNum>
   <w:abstractNum w:abstractNumId="0" w15:restartNumberingAfterBreak="0">
     <w:nsid w:val="2AAA00EF"/>
     <w:multiLevelType w:val="hybridMultilevel"/>
@@ -3652,6 +3747,9 @@
       </w:pPr>
     </w:lvl>
   </w:abstractNum>
+  <w:num w:numId="19">
+    <w:abstractNumId w:val="17"/>
+  </w:num>
   <w:num w:numId="1" w16cid:durableId="1029379587">
     <w:abstractNumId w:val="6"/>
   </w:num>
@@ -3660,9 +3758,7 @@
     <w:lvlOverride w:ilvl="0">
       <w:startOverride w:val="1"/>
     </w:lvlOverride>
-    <w:lvlOverride w:ilvl="1">
-      <w:startOverride w:val="1"/>
-    </w:lvlOverride>
+    <w:lvlOverride w:ilvl="1"/>
     <w:lvlOverride w:ilvl="2">
       <w:startOverride w:val="1"/>
     </w:lvlOverride>
@@ -4173,7 +4269,7 @@
     <w:basedOn w:val="Heading1"/>
     <w:unhideWhenUsed/>
     <w:qFormat/>
-    <w:rsid w:val="7DECB779"/>
+    <w:rsid w:val="4804ACE7"/>
     <w:rPr>
       <w:rFonts w:eastAsia="Calibri"/>
       <w:sz w:val="20"/>

</xml_diff>